<commit_message>
created loading page for incoming user
</commit_message>
<xml_diff>
--- a/Client/public/ASHIK_YUSUF_CV.docx
+++ b/Client/public/ASHIK_YUSUF_CV.docx
@@ -449,8 +449,9 @@
                 <w:sz w:val="24"/>
                 <w:szCs w:val="24"/>
               </w:rPr>
-              <w:t>Ph no:</w:t>
-            </w:r>
+              <w:t xml:space="preserve">Ph </w:t>
+            </w:r>
+            <w:proofErr w:type="gramStart"/>
             <w:r>
               <w:rPr>
                 <w:rFonts w:asciiTheme="majorHAnsi" w:eastAsia="Open Sans" w:hAnsiTheme="majorHAnsi" w:cstheme="majorHAnsi"/>
@@ -458,7 +459,26 @@
                 <w:sz w:val="24"/>
                 <w:szCs w:val="24"/>
               </w:rPr>
-              <w:t>+91 89036 90518</w:t>
+              <w:t>no:</w:t>
+            </w:r>
+            <w:r>
+              <w:rPr>
+                <w:rFonts w:asciiTheme="majorHAnsi" w:eastAsia="Open Sans" w:hAnsiTheme="majorHAnsi" w:cstheme="majorHAnsi"/>
+                <w:color w:val="auto"/>
+                <w:sz w:val="24"/>
+                <w:szCs w:val="24"/>
+              </w:rPr>
+              <w:t>+</w:t>
+            </w:r>
+            <w:proofErr w:type="gramEnd"/>
+            <w:r>
+              <w:rPr>
+                <w:rFonts w:asciiTheme="majorHAnsi" w:eastAsia="Open Sans" w:hAnsiTheme="majorHAnsi" w:cstheme="majorHAnsi"/>
+                <w:color w:val="auto"/>
+                <w:sz w:val="24"/>
+                <w:szCs w:val="24"/>
+              </w:rPr>
+              <w:t>91 89036 90518</w:t>
             </w:r>
           </w:p>
           <w:p>
@@ -722,7 +742,23 @@
                 <w:rFonts w:asciiTheme="majorHAnsi" w:hAnsiTheme="majorHAnsi" w:cstheme="majorHAnsi"/>
                 <w:color w:val="auto"/>
               </w:rPr>
-              <w:t>, Kariapatti —</w:t>
+              <w:t xml:space="preserve">, </w:t>
+            </w:r>
+            <w:proofErr w:type="spellStart"/>
+            <w:r>
+              <w:rPr>
+                <w:rFonts w:asciiTheme="majorHAnsi" w:hAnsiTheme="majorHAnsi" w:cstheme="majorHAnsi"/>
+                <w:color w:val="auto"/>
+              </w:rPr>
+              <w:t>Kariapatti</w:t>
+            </w:r>
+            <w:proofErr w:type="spellEnd"/>
+            <w:r>
+              <w:rPr>
+                <w:rFonts w:asciiTheme="majorHAnsi" w:hAnsiTheme="majorHAnsi" w:cstheme="majorHAnsi"/>
+                <w:color w:val="auto"/>
+              </w:rPr>
+              <w:t xml:space="preserve"> —</w:t>
             </w:r>
             <w:r>
               <w:rPr>
@@ -1457,6 +1493,8 @@
               <w:rPr>
                 <w:rFonts w:asciiTheme="majorHAnsi" w:hAnsiTheme="majorHAnsi" w:cstheme="majorHAnsi"/>
                 <w:color w:val="auto"/>
+                <w:sz w:val="20"/>
+                <w:szCs w:val="20"/>
               </w:rPr>
             </w:pPr>
             <w:r>
@@ -1465,8 +1503,8 @@
                 <w:b/>
                 <w:bCs/>
                 <w:color w:val="auto"/>
-                <w:sz w:val="20"/>
-                <w:szCs w:val="20"/>
+                <w:sz w:val="22"/>
+                <w:szCs w:val="22"/>
               </w:rPr>
               <w:t>Programming Languages</w:t>
             </w:r>
@@ -1476,6 +1514,8 @@
                 <w:b/>
                 <w:bCs/>
                 <w:color w:val="auto"/>
+                <w:sz w:val="20"/>
+                <w:szCs w:val="20"/>
               </w:rPr>
               <w:t>:</w:t>
             </w:r>
@@ -1483,6 +1523,8 @@
               <w:rPr>
                 <w:rFonts w:asciiTheme="majorHAnsi" w:hAnsiTheme="majorHAnsi" w:cstheme="majorHAnsi"/>
                 <w:color w:val="auto"/>
+                <w:sz w:val="20"/>
+                <w:szCs w:val="20"/>
               </w:rPr>
               <w:t xml:space="preserve"> </w:t>
             </w:r>
@@ -1490,6 +1532,8 @@
               <w:rPr>
                 <w:rFonts w:asciiTheme="majorHAnsi" w:hAnsiTheme="majorHAnsi" w:cstheme="majorHAnsi"/>
                 <w:color w:val="auto"/>
+                <w:sz w:val="20"/>
+                <w:szCs w:val="20"/>
               </w:rPr>
               <w:t>JavaScript (</w:t>
             </w:r>
@@ -1497,6 +1541,8 @@
               <w:rPr>
                 <w:rFonts w:asciiTheme="majorHAnsi" w:hAnsiTheme="majorHAnsi" w:cstheme="majorHAnsi"/>
                 <w:color w:val="auto"/>
+                <w:sz w:val="20"/>
+                <w:szCs w:val="20"/>
               </w:rPr>
               <w:t>ES6+)</w:t>
             </w:r>
@@ -1504,6 +1550,8 @@
               <w:rPr>
                 <w:rFonts w:asciiTheme="majorHAnsi" w:hAnsiTheme="majorHAnsi" w:cstheme="majorHAnsi"/>
                 <w:color w:val="auto"/>
+                <w:sz w:val="20"/>
+                <w:szCs w:val="20"/>
               </w:rPr>
               <w:t>, HTML</w:t>
             </w:r>
@@ -1511,6 +1559,8 @@
               <w:rPr>
                 <w:rFonts w:asciiTheme="majorHAnsi" w:hAnsiTheme="majorHAnsi" w:cstheme="majorHAnsi"/>
                 <w:color w:val="auto"/>
+                <w:sz w:val="20"/>
+                <w:szCs w:val="20"/>
               </w:rPr>
               <w:t>5</w:t>
             </w:r>
@@ -1518,6 +1568,8 @@
               <w:rPr>
                 <w:rFonts w:asciiTheme="majorHAnsi" w:hAnsiTheme="majorHAnsi" w:cstheme="majorHAnsi"/>
                 <w:color w:val="auto"/>
+                <w:sz w:val="20"/>
+                <w:szCs w:val="20"/>
               </w:rPr>
               <w:t>, CSS</w:t>
             </w:r>
@@ -1525,6 +1577,8 @@
               <w:rPr>
                 <w:rFonts w:asciiTheme="majorHAnsi" w:hAnsiTheme="majorHAnsi" w:cstheme="majorHAnsi"/>
                 <w:color w:val="auto"/>
+                <w:sz w:val="20"/>
+                <w:szCs w:val="20"/>
               </w:rPr>
               <w:t>3</w:t>
             </w:r>
@@ -1535,6 +1589,8 @@
               <w:rPr>
                 <w:rFonts w:asciiTheme="majorHAnsi" w:hAnsiTheme="majorHAnsi" w:cstheme="majorHAnsi"/>
                 <w:color w:val="auto"/>
+                <w:sz w:val="20"/>
+                <w:szCs w:val="20"/>
               </w:rPr>
             </w:pPr>
             <w:r>
@@ -1543,8 +1599,8 @@
                 <w:b/>
                 <w:bCs/>
                 <w:color w:val="auto"/>
-                <w:sz w:val="20"/>
-                <w:szCs w:val="20"/>
+                <w:sz w:val="22"/>
+                <w:szCs w:val="22"/>
               </w:rPr>
               <w:t>Frameworks &amp; Libraries</w:t>
             </w:r>
@@ -1552,8 +1608,8 @@
               <w:rPr>
                 <w:rFonts w:asciiTheme="majorHAnsi" w:hAnsiTheme="majorHAnsi" w:cstheme="majorHAnsi"/>
                 <w:color w:val="auto"/>
-                <w:sz w:val="20"/>
-                <w:szCs w:val="20"/>
+                <w:sz w:val="22"/>
+                <w:szCs w:val="22"/>
               </w:rPr>
               <w:t xml:space="preserve">: </w:t>
             </w:r>
@@ -1561,6 +1617,8 @@
               <w:rPr>
                 <w:rFonts w:asciiTheme="majorHAnsi" w:hAnsiTheme="majorHAnsi" w:cstheme="majorHAnsi"/>
                 <w:color w:val="auto"/>
+                <w:sz w:val="20"/>
+                <w:szCs w:val="20"/>
               </w:rPr>
               <w:t>React.js,</w:t>
             </w:r>
@@ -1568,6 +1626,8 @@
               <w:rPr>
                 <w:rFonts w:asciiTheme="majorHAnsi" w:hAnsiTheme="majorHAnsi" w:cstheme="majorHAnsi"/>
                 <w:color w:val="auto"/>
+                <w:sz w:val="20"/>
+                <w:szCs w:val="20"/>
               </w:rPr>
               <w:t xml:space="preserve"> Tailwind CSS,</w:t>
             </w:r>
@@ -1575,6 +1635,8 @@
               <w:rPr>
                 <w:rFonts w:asciiTheme="majorHAnsi" w:hAnsiTheme="majorHAnsi" w:cstheme="majorHAnsi"/>
                 <w:color w:val="auto"/>
+                <w:sz w:val="20"/>
+                <w:szCs w:val="20"/>
               </w:rPr>
               <w:t xml:space="preserve"> Node.js, Express.js</w:t>
             </w:r>
@@ -1582,6 +1644,8 @@
               <w:rPr>
                 <w:rFonts w:asciiTheme="majorHAnsi" w:hAnsiTheme="majorHAnsi" w:cstheme="majorHAnsi"/>
                 <w:color w:val="auto"/>
+                <w:sz w:val="20"/>
+                <w:szCs w:val="20"/>
               </w:rPr>
               <w:t>.</w:t>
             </w:r>
@@ -1592,6 +1656,8 @@
               <w:rPr>
                 <w:rFonts w:asciiTheme="majorHAnsi" w:hAnsiTheme="majorHAnsi" w:cstheme="majorHAnsi"/>
                 <w:color w:val="auto"/>
+                <w:sz w:val="20"/>
+                <w:szCs w:val="20"/>
               </w:rPr>
             </w:pPr>
             <w:r>
@@ -1600,8 +1666,8 @@
                 <w:b/>
                 <w:bCs/>
                 <w:color w:val="auto"/>
-                <w:sz w:val="20"/>
-                <w:szCs w:val="20"/>
+                <w:sz w:val="22"/>
+                <w:szCs w:val="22"/>
               </w:rPr>
               <w:t>Databases:</w:t>
             </w:r>
@@ -1609,8 +1675,8 @@
               <w:rPr>
                 <w:rFonts w:asciiTheme="majorHAnsi" w:hAnsiTheme="majorHAnsi" w:cstheme="majorHAnsi"/>
                 <w:color w:val="auto"/>
-                <w:sz w:val="20"/>
-                <w:szCs w:val="20"/>
+                <w:sz w:val="22"/>
+                <w:szCs w:val="22"/>
               </w:rPr>
               <w:t xml:space="preserve"> </w:t>
             </w:r>
@@ -1618,6 +1684,8 @@
               <w:rPr>
                 <w:rFonts w:asciiTheme="majorHAnsi" w:hAnsiTheme="majorHAnsi" w:cstheme="majorHAnsi"/>
                 <w:color w:val="auto"/>
+                <w:sz w:val="20"/>
+                <w:szCs w:val="20"/>
               </w:rPr>
               <w:t>MongoDB, MySQL</w:t>
             </w:r>
@@ -1628,6 +1696,8 @@
               <w:rPr>
                 <w:rFonts w:asciiTheme="majorHAnsi" w:hAnsiTheme="majorHAnsi" w:cstheme="majorHAnsi"/>
                 <w:color w:val="auto"/>
+                <w:sz w:val="20"/>
+                <w:szCs w:val="20"/>
               </w:rPr>
             </w:pPr>
             <w:r>
@@ -1636,8 +1706,8 @@
                 <w:b/>
                 <w:bCs/>
                 <w:color w:val="auto"/>
-                <w:sz w:val="20"/>
-                <w:szCs w:val="20"/>
+                <w:sz w:val="22"/>
+                <w:szCs w:val="22"/>
               </w:rPr>
               <w:t>Tools &amp; Platforms:</w:t>
             </w:r>
@@ -1645,8 +1715,8 @@
               <w:rPr>
                 <w:rFonts w:asciiTheme="majorHAnsi" w:hAnsiTheme="majorHAnsi" w:cstheme="majorHAnsi"/>
                 <w:color w:val="auto"/>
-                <w:sz w:val="20"/>
-                <w:szCs w:val="20"/>
+                <w:sz w:val="22"/>
+                <w:szCs w:val="22"/>
               </w:rPr>
               <w:t xml:space="preserve"> </w:t>
             </w:r>
@@ -1654,6 +1724,8 @@
               <w:rPr>
                 <w:rFonts w:asciiTheme="majorHAnsi" w:hAnsiTheme="majorHAnsi" w:cstheme="majorHAnsi"/>
                 <w:color w:val="auto"/>
+                <w:sz w:val="20"/>
+                <w:szCs w:val="20"/>
               </w:rPr>
               <w:t>Git, GitHub, Postman, Excel</w:t>
             </w:r>
@@ -1663,6 +1735,8 @@
               <w:rPr>
                 <w:rFonts w:asciiTheme="majorHAnsi" w:hAnsiTheme="majorHAnsi" w:cstheme="majorHAnsi"/>
                 <w:color w:val="auto"/>
+                <w:sz w:val="20"/>
+                <w:szCs w:val="20"/>
               </w:rPr>
               <w:t>.</w:t>
             </w:r>
@@ -1707,16 +1781,16 @@
               <w:rPr>
                 <w:rFonts w:asciiTheme="majorHAnsi" w:hAnsiTheme="majorHAnsi" w:cstheme="majorHAnsi"/>
                 <w:color w:val="auto"/>
-                <w:sz w:val="20"/>
-                <w:szCs w:val="20"/>
+                <w:sz w:val="22"/>
+                <w:szCs w:val="22"/>
               </w:rPr>
             </w:pPr>
             <w:r>
               <w:rPr>
                 <w:rFonts w:asciiTheme="majorHAnsi" w:hAnsiTheme="majorHAnsi" w:cstheme="majorHAnsi"/>
                 <w:color w:val="auto"/>
-                <w:sz w:val="20"/>
-                <w:szCs w:val="20"/>
+                <w:sz w:val="22"/>
+                <w:szCs w:val="22"/>
               </w:rPr>
               <w:t xml:space="preserve">• </w:t>
             </w:r>
@@ -1724,8 +1798,8 @@
               <w:rPr>
                 <w:rFonts w:asciiTheme="majorHAnsi" w:hAnsiTheme="majorHAnsi" w:cstheme="majorHAnsi"/>
                 <w:color w:val="auto"/>
-                <w:sz w:val="20"/>
-                <w:szCs w:val="20"/>
+                <w:sz w:val="22"/>
+                <w:szCs w:val="22"/>
               </w:rPr>
               <w:t>Certified in Python Programming – Infosys Springboard – 2024</w:t>
             </w:r>
@@ -1738,16 +1812,16 @@
               <w:rPr>
                 <w:rFonts w:asciiTheme="majorHAnsi" w:hAnsiTheme="majorHAnsi" w:cstheme="majorHAnsi"/>
                 <w:color w:val="auto"/>
-                <w:sz w:val="20"/>
-                <w:szCs w:val="20"/>
+                <w:sz w:val="22"/>
+                <w:szCs w:val="22"/>
               </w:rPr>
             </w:pPr>
             <w:r>
               <w:rPr>
                 <w:rFonts w:asciiTheme="majorHAnsi" w:hAnsiTheme="majorHAnsi" w:cstheme="majorHAnsi"/>
                 <w:color w:val="auto"/>
-                <w:sz w:val="20"/>
-                <w:szCs w:val="20"/>
+                <w:sz w:val="22"/>
+                <w:szCs w:val="22"/>
               </w:rPr>
               <w:t xml:space="preserve">• </w:t>
             </w:r>
@@ -1755,8 +1829,8 @@
               <w:rPr>
                 <w:rFonts w:asciiTheme="majorHAnsi" w:hAnsiTheme="majorHAnsi" w:cstheme="majorHAnsi"/>
                 <w:color w:val="auto"/>
-                <w:sz w:val="20"/>
-                <w:szCs w:val="20"/>
+                <w:sz w:val="22"/>
+                <w:szCs w:val="22"/>
               </w:rPr>
               <w:t>HTML</w:t>
             </w:r>
@@ -1764,8 +1838,8 @@
               <w:rPr>
                 <w:rFonts w:asciiTheme="majorHAnsi" w:hAnsiTheme="majorHAnsi" w:cstheme="majorHAnsi"/>
                 <w:color w:val="auto"/>
-                <w:sz w:val="20"/>
-                <w:szCs w:val="20"/>
+                <w:sz w:val="22"/>
+                <w:szCs w:val="22"/>
               </w:rPr>
               <w:t xml:space="preserve"> Practice Certificate – Code</w:t>
             </w:r>
@@ -1773,8 +1847,8 @@
               <w:rPr>
                 <w:rFonts w:asciiTheme="majorHAnsi" w:hAnsiTheme="majorHAnsi" w:cstheme="majorHAnsi"/>
                 <w:color w:val="auto"/>
-                <w:sz w:val="20"/>
-                <w:szCs w:val="20"/>
+                <w:sz w:val="22"/>
+                <w:szCs w:val="22"/>
               </w:rPr>
               <w:t xml:space="preserve"> </w:t>
             </w:r>
@@ -1782,8 +1856,8 @@
               <w:rPr>
                 <w:rFonts w:asciiTheme="majorHAnsi" w:hAnsiTheme="majorHAnsi" w:cstheme="majorHAnsi"/>
                 <w:color w:val="auto"/>
-                <w:sz w:val="20"/>
-                <w:szCs w:val="20"/>
+                <w:sz w:val="22"/>
+                <w:szCs w:val="22"/>
               </w:rPr>
               <w:t>Chef – 202</w:t>
             </w:r>
@@ -1791,8 +1865,8 @@
               <w:rPr>
                 <w:rFonts w:asciiTheme="majorHAnsi" w:hAnsiTheme="majorHAnsi" w:cstheme="majorHAnsi"/>
                 <w:color w:val="auto"/>
-                <w:sz w:val="20"/>
-                <w:szCs w:val="20"/>
+                <w:sz w:val="22"/>
+                <w:szCs w:val="22"/>
               </w:rPr>
               <w:t>5</w:t>
             </w:r>
@@ -1800,8 +1874,8 @@
               <w:rPr>
                 <w:rFonts w:asciiTheme="majorHAnsi" w:hAnsiTheme="majorHAnsi" w:cstheme="majorHAnsi"/>
                 <w:color w:val="auto"/>
-                <w:sz w:val="20"/>
-                <w:szCs w:val="20"/>
+                <w:sz w:val="22"/>
+                <w:szCs w:val="22"/>
               </w:rPr>
               <w:t>.</w:t>
             </w:r>
@@ -1814,8 +1888,8 @@
               <w:rPr>
                 <w:rFonts w:asciiTheme="majorHAnsi" w:hAnsiTheme="majorHAnsi" w:cstheme="majorHAnsi"/>
                 <w:color w:val="auto"/>
-                <w:sz w:val="20"/>
-                <w:szCs w:val="20"/>
+                <w:sz w:val="22"/>
+                <w:szCs w:val="22"/>
               </w:rPr>
             </w:pPr>
           </w:p>
@@ -1831,16 +1905,16 @@
               <w:rPr>
                 <w:rFonts w:asciiTheme="majorHAnsi" w:hAnsiTheme="majorHAnsi" w:cstheme="majorHAnsi"/>
                 <w:color w:val="auto"/>
-                <w:sz w:val="20"/>
-                <w:szCs w:val="20"/>
+                <w:sz w:val="22"/>
+                <w:szCs w:val="22"/>
               </w:rPr>
             </w:pPr>
             <w:r>
               <w:rPr>
                 <w:rFonts w:asciiTheme="majorHAnsi" w:hAnsiTheme="majorHAnsi" w:cstheme="majorHAnsi"/>
                 <w:color w:val="auto"/>
-                <w:sz w:val="20"/>
-                <w:szCs w:val="20"/>
+                <w:sz w:val="22"/>
+                <w:szCs w:val="22"/>
               </w:rPr>
               <w:t xml:space="preserve">• </w:t>
             </w:r>
@@ -1848,8 +1922,8 @@
               <w:rPr>
                 <w:rFonts w:asciiTheme="majorHAnsi" w:hAnsiTheme="majorHAnsi" w:cstheme="majorHAnsi"/>
                 <w:color w:val="auto"/>
-                <w:sz w:val="20"/>
-                <w:szCs w:val="20"/>
+                <w:sz w:val="22"/>
+                <w:szCs w:val="22"/>
               </w:rPr>
               <w:t>JavaScript Practice Certificate – Code</w:t>
             </w:r>
@@ -1857,8 +1931,8 @@
               <w:rPr>
                 <w:rFonts w:asciiTheme="majorHAnsi" w:hAnsiTheme="majorHAnsi" w:cstheme="majorHAnsi"/>
                 <w:color w:val="auto"/>
-                <w:sz w:val="20"/>
-                <w:szCs w:val="20"/>
+                <w:sz w:val="22"/>
+                <w:szCs w:val="22"/>
               </w:rPr>
               <w:t xml:space="preserve"> </w:t>
             </w:r>
@@ -1866,8 +1940,8 @@
               <w:rPr>
                 <w:rFonts w:asciiTheme="majorHAnsi" w:hAnsiTheme="majorHAnsi" w:cstheme="majorHAnsi"/>
                 <w:color w:val="auto"/>
-                <w:sz w:val="20"/>
-                <w:szCs w:val="20"/>
+                <w:sz w:val="22"/>
+                <w:szCs w:val="22"/>
               </w:rPr>
               <w:t>Chef – 202</w:t>
             </w:r>
@@ -1875,8 +1949,8 @@
               <w:rPr>
                 <w:rFonts w:asciiTheme="majorHAnsi" w:hAnsiTheme="majorHAnsi" w:cstheme="majorHAnsi"/>
                 <w:color w:val="auto"/>
-                <w:sz w:val="20"/>
-                <w:szCs w:val="20"/>
+                <w:sz w:val="22"/>
+                <w:szCs w:val="22"/>
               </w:rPr>
               <w:t>5</w:t>
             </w:r>
@@ -1884,8 +1958,8 @@
               <w:rPr>
                 <w:rFonts w:asciiTheme="majorHAnsi" w:hAnsiTheme="majorHAnsi" w:cstheme="majorHAnsi"/>
                 <w:color w:val="auto"/>
-                <w:sz w:val="20"/>
-                <w:szCs w:val="20"/>
+                <w:sz w:val="22"/>
+                <w:szCs w:val="22"/>
               </w:rPr>
               <w:t>.</w:t>
             </w:r>
@@ -1949,8 +2023,8 @@
               <w:rPr>
                 <w:rFonts w:asciiTheme="majorHAnsi" w:hAnsiTheme="majorHAnsi" w:cstheme="majorHAnsi"/>
                 <w:color w:val="auto"/>
-                <w:sz w:val="20"/>
-                <w:szCs w:val="20"/>
+                <w:sz w:val="22"/>
+                <w:szCs w:val="22"/>
                 <w:lang w:val="en-US"/>
               </w:rPr>
             </w:pPr>
@@ -1958,8 +2032,8 @@
               <w:rPr>
                 <w:rFonts w:asciiTheme="majorHAnsi" w:hAnsiTheme="majorHAnsi" w:cstheme="majorHAnsi"/>
                 <w:color w:val="auto"/>
-                <w:sz w:val="20"/>
-                <w:szCs w:val="20"/>
+                <w:sz w:val="22"/>
+                <w:szCs w:val="22"/>
                 <w:lang w:val="en-US"/>
               </w:rPr>
               <w:t>Communication &amp; Presentation Skills</w:t>
@@ -1977,8 +2051,8 @@
               <w:rPr>
                 <w:rFonts w:asciiTheme="majorHAnsi" w:hAnsiTheme="majorHAnsi" w:cstheme="majorHAnsi"/>
                 <w:color w:val="auto"/>
-                <w:sz w:val="20"/>
-                <w:szCs w:val="20"/>
+                <w:sz w:val="22"/>
+                <w:szCs w:val="22"/>
                 <w:lang w:val="en-US"/>
               </w:rPr>
             </w:pPr>
@@ -1986,8 +2060,8 @@
               <w:rPr>
                 <w:rFonts w:asciiTheme="majorHAnsi" w:hAnsiTheme="majorHAnsi" w:cstheme="majorHAnsi"/>
                 <w:color w:val="auto"/>
-                <w:sz w:val="20"/>
-                <w:szCs w:val="20"/>
+                <w:sz w:val="22"/>
+                <w:szCs w:val="22"/>
                 <w:lang w:val="en-US"/>
               </w:rPr>
               <w:t>Team Collaboration &amp; Adaptability</w:t>
@@ -2005,8 +2079,8 @@
               <w:rPr>
                 <w:rFonts w:asciiTheme="majorHAnsi" w:hAnsiTheme="majorHAnsi" w:cstheme="majorHAnsi"/>
                 <w:color w:val="auto"/>
-                <w:sz w:val="20"/>
-                <w:szCs w:val="20"/>
+                <w:sz w:val="22"/>
+                <w:szCs w:val="22"/>
                 <w:lang w:val="en-US"/>
               </w:rPr>
             </w:pPr>
@@ -2014,8 +2088,8 @@
               <w:rPr>
                 <w:rFonts w:asciiTheme="majorHAnsi" w:hAnsiTheme="majorHAnsi" w:cstheme="majorHAnsi"/>
                 <w:color w:val="auto"/>
-                <w:sz w:val="20"/>
-                <w:szCs w:val="20"/>
+                <w:sz w:val="22"/>
+                <w:szCs w:val="22"/>
                 <w:lang w:val="en-US"/>
               </w:rPr>
               <w:t>Time Management &amp; Quick Learning</w:t>
@@ -2065,16 +2139,16 @@
               <w:rPr>
                 <w:rFonts w:asciiTheme="majorHAnsi" w:hAnsiTheme="majorHAnsi" w:cstheme="majorHAnsi"/>
                 <w:color w:val="auto"/>
-                <w:sz w:val="20"/>
-                <w:szCs w:val="20"/>
+                <w:sz w:val="22"/>
+                <w:szCs w:val="22"/>
               </w:rPr>
             </w:pPr>
             <w:r>
               <w:rPr>
                 <w:rFonts w:asciiTheme="majorHAnsi" w:hAnsiTheme="majorHAnsi" w:cstheme="majorHAnsi"/>
                 <w:color w:val="auto"/>
-                <w:sz w:val="20"/>
-                <w:szCs w:val="20"/>
+                <w:sz w:val="22"/>
+                <w:szCs w:val="22"/>
               </w:rPr>
               <w:t xml:space="preserve">• </w:t>
             </w:r>
@@ -2082,8 +2156,8 @@
               <w:rPr>
                 <w:rFonts w:asciiTheme="majorHAnsi" w:hAnsiTheme="majorHAnsi" w:cstheme="majorHAnsi"/>
                 <w:color w:val="auto"/>
-                <w:sz w:val="20"/>
-                <w:szCs w:val="20"/>
+                <w:sz w:val="22"/>
+                <w:szCs w:val="22"/>
               </w:rPr>
               <w:t>Full Stack Web Development using MERN Stack.</w:t>
             </w:r>
@@ -4849,7 +4923,6 @@
 <ds:datastoreItem xmlns:ds="http://schemas.openxmlformats.org/officeDocument/2006/customXml" ds:itemID="{64FAC278-C863-45C7-AEF9-852BEC66F37D}">
   <ds:schemaRefs>
     <ds:schemaRef ds:uri="http://schemas.openxmlformats.org/officeDocument/2006/bibliography"/>
-    <ds:schemaRef ds:uri="http://www.w3.org/2000/xmlns/"/>
   </ds:schemaRefs>
 </ds:datastoreItem>
 </file>
</xml_diff>